<commit_message>
Refine learning portfolio content and verification flow
</commit_message>
<xml_diff>
--- a/output/doc/Daffa_Ghiffary_Kusuma_CV_Learning_Designer_Program_Manager_Polished_2026.docx
+++ b/output/doc/Daffa_Ghiffary_Kusuma_CV_Learning_Designer_Program_Manager_Polished_2026.docx
@@ -365,7 +365,7 @@
                 <w:color w:val="183F60"/>
                 <w:sz w:val="16"/>
               </w:rPr>
-              <w:t>NPS examples</w:t>
+              <w:t>NPS</w:t>
             </w:r>
           </w:p>
           <w:p>
@@ -1154,7 +1154,7 @@
             </w:tcMar>
           </w:tcPr>
           <w:p>
-            <w:hyperlink r:id="rId12">
+            <w:hyperlink r:id="rId10">
               <w:r>
                 <w:rPr>
                   <w:color w:val="0563C1"/>
@@ -1166,7 +1166,7 @@
             <w:r>
               <w:t xml:space="preserve">; </w:t>
             </w:r>
-            <w:hyperlink r:id="rId12">
+            <w:hyperlink r:id="rId11">
               <w:r>
                 <w:rPr>
                   <w:color w:val="0563C1"/>
@@ -1202,7 +1202,7 @@
             <w:r>
               <w:t xml:space="preserve">; </w:t>
             </w:r>
-            <w:hyperlink r:id="rId13">
+            <w:hyperlink r:id="rId14">
               <w:r>
                 <w:rPr>
                   <w:color w:val="0563C1"/>
@@ -1214,7 +1214,7 @@
             <w:r>
               <w:t xml:space="preserve">; </w:t>
             </w:r>
-            <w:hyperlink r:id="rId13">
+            <w:hyperlink r:id="rId15">
               <w:r>
                 <w:rPr>
                   <w:color w:val="0563C1"/>
@@ -1276,7 +1276,7 @@
             </w:tcMar>
           </w:tcPr>
           <w:p>
-            <w:hyperlink r:id="rId12">
+            <w:hyperlink r:id="rId16">
               <w:r>
                 <w:rPr>
                   <w:color w:val="0563C1"/>
@@ -1288,7 +1288,7 @@
             <w:r>
               <w:t xml:space="preserve">; </w:t>
             </w:r>
-            <w:hyperlink r:id="rId12">
+            <w:hyperlink r:id="rId17">
               <w:r>
                 <w:rPr>
                   <w:color w:val="0563C1"/>
@@ -1300,7 +1300,7 @@
             <w:r>
               <w:t xml:space="preserve">; </w:t>
             </w:r>
-            <w:hyperlink r:id="rId12">
+            <w:hyperlink r:id="rId18">
               <w:r>
                 <w:rPr>
                   <w:color w:val="0563C1"/>
@@ -1312,7 +1312,7 @@
             <w:r>
               <w:t xml:space="preserve">; </w:t>
             </w:r>
-            <w:hyperlink r:id="rId13">
+            <w:hyperlink r:id="rId19">
               <w:r>
                 <w:rPr>
                   <w:color w:val="0563C1"/>
@@ -1324,7 +1324,7 @@
             <w:r>
               <w:t xml:space="preserve">; </w:t>
             </w:r>
-            <w:hyperlink r:id="rId13">
+            <w:hyperlink r:id="rId20">
               <w:r>
                 <w:rPr>
                   <w:color w:val="0563C1"/>
@@ -1336,7 +1336,7 @@
             <w:r>
               <w:t xml:space="preserve">; </w:t>
             </w:r>
-            <w:hyperlink r:id="rId14">
+            <w:hyperlink r:id="rId21" w:anchor="project-recruitment-assessment-blueprint">
               <w:r>
                 <w:rPr>
                   <w:color w:val="0563C1"/>
@@ -1398,7 +1398,7 @@
             </w:tcMar>
           </w:tcPr>
           <w:p>
-            <w:hyperlink r:id="rId15">
+            <w:hyperlink r:id="rId22" w:anchor="project-adaptive-communication-decode-and-connect">
               <w:r>
                 <w:rPr>
                   <w:color w:val="0563C1"/>
@@ -1410,7 +1410,7 @@
             <w:r>
               <w:t xml:space="preserve">; </w:t>
             </w:r>
-            <w:hyperlink r:id="rId16">
+            <w:hyperlink r:id="rId23" w:anchor="project-strengthen-teamwork-with-empathy-and-communication">
               <w:r>
                 <w:rPr>
                   <w:color w:val="0563C1"/>
@@ -1422,7 +1422,7 @@
             <w:r>
               <w:t xml:space="preserve">; </w:t>
             </w:r>
-            <w:hyperlink r:id="rId17">
+            <w:hyperlink r:id="rId24" w:anchor="project-building-a-culture-of-service-excellence-in-the-digital-era">
               <w:r>
                 <w:rPr>
                   <w:color w:val="0563C1"/>
@@ -1434,7 +1434,7 @@
             <w:r>
               <w:t xml:space="preserve">; </w:t>
             </w:r>
-            <w:hyperlink r:id="rId18">
+            <w:hyperlink r:id="rId25" w:anchor="project-public-speaking-and-confidence-boost">
               <w:r>
                 <w:rPr>
                   <w:color w:val="0563C1"/>
@@ -1446,7 +1446,7 @@
             <w:r>
               <w:t xml:space="preserve">; </w:t>
             </w:r>
-            <w:hyperlink r:id="rId19">
+            <w:hyperlink r:id="rId26" w:anchor="project-mastering-critical-thinking-for-future-proofing-your-career">
               <w:r>
                 <w:rPr>
                   <w:color w:val="0563C1"/>
@@ -1458,7 +1458,7 @@
             <w:r>
               <w:t xml:space="preserve">; </w:t>
             </w:r>
-            <w:hyperlink r:id="rId20">
+            <w:hyperlink r:id="rId27" w:anchor="project-stress-and-time-management">
               <w:r>
                 <w:rPr>
                   <w:color w:val="0563C1"/>
@@ -1470,7 +1470,7 @@
             <w:r>
               <w:t xml:space="preserve">; </w:t>
             </w:r>
-            <w:hyperlink r:id="rId21">
+            <w:hyperlink r:id="rId28" w:anchor="project-menguasai-komunikasi-maritim-yang-efektif">
               <w:r>
                 <w:rPr>
                   <w:color w:val="0563C1"/>
@@ -1482,7 +1482,7 @@
             <w:r>
               <w:t xml:space="preserve">; </w:t>
             </w:r>
-            <w:hyperlink r:id="rId22">
+            <w:hyperlink r:id="rId29" w:anchor="project-ai-powered-personal-branding-for-linkedin">
               <w:r>
                 <w:rPr>
                   <w:color w:val="0563C1"/>
@@ -1544,7 +1544,7 @@
             </w:tcMar>
           </w:tcPr>
           <w:p>
-            <w:hyperlink r:id="rId23">
+            <w:hyperlink r:id="rId30" w:anchor="project-startup-development-class">
               <w:r>
                 <w:rPr>
                   <w:color w:val="0563C1"/>
@@ -1556,7 +1556,7 @@
             <w:r>
               <w:t xml:space="preserve">; </w:t>
             </w:r>
-            <w:hyperlink r:id="rId24">
+            <w:hyperlink r:id="rId31" w:anchor="project-umkm-s-simple-financial-management">
               <w:r>
                 <w:rPr>
                   <w:color w:val="0563C1"/>
@@ -1568,7 +1568,7 @@
             <w:r>
               <w:t xml:space="preserve">; </w:t>
             </w:r>
-            <w:hyperlink r:id="rId25">
+            <w:hyperlink r:id="rId32" w:anchor="project-financial-modeling">
               <w:r>
                 <w:rPr>
                   <w:color w:val="0563C1"/>
@@ -1580,7 +1580,7 @@
             <w:r>
               <w:t xml:space="preserve">; </w:t>
             </w:r>
-            <w:hyperlink r:id="rId26">
+            <w:hyperlink r:id="rId33" w:anchor="project-growth-mindset">
               <w:r>
                 <w:rPr>
                   <w:color w:val="0563C1"/>
@@ -1592,7 +1592,7 @@
             <w:r>
               <w:t xml:space="preserve">; </w:t>
             </w:r>
-            <w:hyperlink r:id="rId27">
+            <w:hyperlink r:id="rId34" w:anchor="project-make-your-product-fit-with-design-thinking">
               <w:r>
                 <w:rPr>
                   <w:color w:val="0563C1"/>
@@ -1604,7 +1604,7 @@
             <w:r>
               <w:t xml:space="preserve">; </w:t>
             </w:r>
-            <w:hyperlink r:id="rId28">
+            <w:hyperlink r:id="rId35" w:anchor="project-business-management-and-adaptability-for-msmes">
               <w:r>
                 <w:rPr>
                   <w:color w:val="0563C1"/>
@@ -1616,7 +1616,7 @@
             <w:r>
               <w:t xml:space="preserve">; </w:t>
             </w:r>
-            <w:hyperlink r:id="rId29">
+            <w:hyperlink r:id="rId36" w:anchor="project-how-to-leverage-social-media-instagram-for-msmes">
               <w:r>
                 <w:rPr>
                   <w:color w:val="0563C1"/>
@@ -1628,7 +1628,7 @@
             <w:r>
               <w:t xml:space="preserve">; </w:t>
             </w:r>
-            <w:hyperlink r:id="rId30">
+            <w:hyperlink r:id="rId37" w:anchor="project-nhi-bandung-business-acceleration-bootcamp">
               <w:r>
                 <w:rPr>
                   <w:color w:val="0563C1"/>
@@ -1640,7 +1640,7 @@
             <w:r>
               <w:t xml:space="preserve">; </w:t>
             </w:r>
-            <w:hyperlink r:id="rId31">
+            <w:hyperlink r:id="rId38" w:anchor="project-entrepreneurship-mentorship-for-sandination-community">
               <w:r>
                 <w:rPr>
                   <w:color w:val="0563C1"/>
@@ -1702,7 +1702,7 @@
             </w:tcMar>
           </w:tcPr>
           <w:p>
-            <w:hyperlink r:id="rId32">
+            <w:hyperlink r:id="rId39" w:anchor="project-miles-unfair-advantage-mentoring-workbook">
               <w:r>
                 <w:rPr>
                   <w:color w:val="0563C1"/>
@@ -1714,7 +1714,7 @@
             <w:r>
               <w:t xml:space="preserve">; </w:t>
             </w:r>
-            <w:hyperlink r:id="rId33">
+            <w:hyperlink r:id="rId40">
               <w:r>
                 <w:rPr>
                   <w:color w:val="0563C1"/>
@@ -1726,7 +1726,7 @@
             <w:r>
               <w:t xml:space="preserve">; </w:t>
             </w:r>
-            <w:hyperlink r:id="rId33">
+            <w:hyperlink r:id="rId41">
               <w:r>
                 <w:rPr>
                   <w:color w:val="0563C1"/>
@@ -1738,7 +1738,7 @@
             <w:r>
               <w:t xml:space="preserve">; </w:t>
             </w:r>
-            <w:hyperlink r:id="rId34">
+            <w:hyperlink r:id="rId42" w:anchor="project-digital-marketing-portfolio-workshop-deck">
               <w:r>
                 <w:rPr>
                   <w:color w:val="0563C1"/>
@@ -1750,7 +1750,7 @@
             <w:r>
               <w:t xml:space="preserve">; </w:t>
             </w:r>
-            <w:hyperlink r:id="rId35">
+            <w:hyperlink r:id="rId43" w:anchor="project-brand-yourself-stand-out-with-personal-branding-and-linkedin-optimization">
               <w:r>
                 <w:rPr>
                   <w:color w:val="0563C1"/>

</xml_diff>

<commit_message>
Refactor learning portfolio content and asset pipeline
</commit_message>
<xml_diff>
--- a/output/doc/Daffa_Ghiffary_Kusuma_CV_Learning_Designer_Program_Manager_Polished_2026.docx
+++ b/output/doc/Daffa_Ghiffary_Kusuma_CV_Learning_Designer_Program_Manager_Polished_2026.docx
@@ -45,7 +45,27 @@
                 <w:color w:val="183F60"/>
                 <w:sz w:val="40"/>
               </w:rPr>
-              <w:t>Daffa Ghiffary Kusuma, S.Psi.</w:t>
+              <w:t xml:space="preserve">Daffa Ghiffary Kusuma, </w:t>
+            </w:r>
+            <w:proofErr w:type="spellStart"/>
+            <w:proofErr w:type="gramStart"/>
+            <w:r>
+              <w:rPr>
+                <w:b/>
+                <w:color w:val="183F60"/>
+                <w:sz w:val="40"/>
+              </w:rPr>
+              <w:t>S.Psi</w:t>
+            </w:r>
+            <w:proofErr w:type="spellEnd"/>
+            <w:proofErr w:type="gramEnd"/>
+            <w:r>
+              <w:rPr>
+                <w:b/>
+                <w:color w:val="183F60"/>
+                <w:sz w:val="40"/>
+              </w:rPr>
+              <w:t>.</w:t>
             </w:r>
           </w:p>
           <w:p>
@@ -70,7 +90,23 @@
                 <w:color w:val="565F69"/>
                 <w:sz w:val="17"/>
               </w:rPr>
-              <w:t xml:space="preserve">Jakarta, Indonesia  |  </w:t>
+              <w:t xml:space="preserve">Jakarta, </w:t>
+            </w:r>
+            <w:proofErr w:type="gramStart"/>
+            <w:r>
+              <w:rPr>
+                <w:color w:val="565F69"/>
+                <w:sz w:val="17"/>
+              </w:rPr>
+              <w:t>Indonesia  |</w:t>
+            </w:r>
+            <w:proofErr w:type="gramEnd"/>
+            <w:r>
+              <w:rPr>
+                <w:color w:val="565F69"/>
+                <w:sz w:val="17"/>
+              </w:rPr>
+              <w:t xml:space="preserve">  </w:t>
             </w:r>
             <w:hyperlink r:id="rId6">
               <w:r>
@@ -741,7 +777,27 @@
         <w:rPr>
           <w:b/>
         </w:rPr>
-        <w:t>Eighteen Rekrutmen Asia - Learning and Development Specialist</w:t>
+        <w:t xml:space="preserve">Eighteen </w:t>
+      </w:r>
+      <w:proofErr w:type="spellStart"/>
+      <w:r>
+        <w:rPr>
+          <w:b/>
+        </w:rPr>
+        <w:t>Rekrutmen</w:t>
+      </w:r>
+      <w:proofErr w:type="spellEnd"/>
+      <w:r>
+        <w:rPr>
+          <w:b/>
+        </w:rPr>
+        <w:t xml:space="preserve"> Asia - Learning and Development Specialist</w:t>
+      </w:r>
+      <w:r>
+        <w:rPr>
+          <w:b/>
+        </w:rPr>
+        <w:t xml:space="preserve"> (Freelance)</w:t>
       </w:r>
       <w:r>
         <w:t xml:space="preserve"> </w:t>
@@ -759,7 +815,15 @@
         <w:pStyle w:val="HRBullet"/>
       </w:pPr>
       <w:r>
-        <w:t>- Built L&amp;D strategy and learning architecture across macro TNA, competency mapping, competency-based syllabus design, business planning, and training-solution marketing.</w:t>
+        <w:t xml:space="preserve">- Built L&amp;D strategy and learning architecture across </w:t>
+      </w:r>
+      <w:proofErr w:type="gramStart"/>
+      <w:r>
+        <w:t>macro TNA</w:t>
+      </w:r>
+      <w:proofErr w:type="gramEnd"/>
+      <w:r>
+        <w:t>, competency mapping, competency-based syllabus design, business planning, and training-solution marketing.</w:t>
       </w:r>
     </w:p>
     <w:p>
@@ -778,11 +842,19 @@
           <w:sz w:val="19"/>
         </w:rPr>
       </w:pPr>
+      <w:proofErr w:type="spellStart"/>
       <w:r>
         <w:rPr>
           <w:b/>
         </w:rPr>
-        <w:t>Kerja Cer-Dias - Learning Designer (Freelance)</w:t>
+        <w:t>Kerja</w:t>
+      </w:r>
+      <w:proofErr w:type="spellEnd"/>
+      <w:r>
+        <w:rPr>
+          <w:b/>
+        </w:rPr>
+        <w:t xml:space="preserve"> Cer-Dias - Learning Designer (Freelance)</w:t>
       </w:r>
       <w:r>
         <w:t xml:space="preserve"> </w:t>
@@ -828,7 +900,35 @@
         <w:rPr>
           <w:b/>
         </w:rPr>
-        <w:t>Badan Kepegawaian Daerah Provinsi Jawa Barat - Machine Learning Engineer, Assessment Project</w:t>
+        <w:t xml:space="preserve">Badan </w:t>
+      </w:r>
+      <w:proofErr w:type="spellStart"/>
+      <w:r>
+        <w:rPr>
+          <w:b/>
+        </w:rPr>
+        <w:t>Kepegawaian</w:t>
+      </w:r>
+      <w:proofErr w:type="spellEnd"/>
+      <w:r>
+        <w:rPr>
+          <w:b/>
+        </w:rPr>
+        <w:t xml:space="preserve"> Daerah </w:t>
+      </w:r>
+      <w:proofErr w:type="spellStart"/>
+      <w:r>
+        <w:rPr>
+          <w:b/>
+        </w:rPr>
+        <w:t>Provinsi</w:t>
+      </w:r>
+      <w:proofErr w:type="spellEnd"/>
+      <w:r>
+        <w:rPr>
+          <w:b/>
+        </w:rPr>
+        <w:t xml:space="preserve"> Jawa Barat - Machine Learning Engineer, Assessment Project</w:t>
       </w:r>
       <w:r>
         <w:rPr>
@@ -843,7 +943,23 @@
         <w:pStyle w:val="HRBullet"/>
       </w:pPr>
       <w:r>
-        <w:t>- Architected a RAG autograding system for ASN competency assessments using 100,000+ assessment records across Case Analysis, Behavioral Event Interview, and QKom Forms.</w:t>
+        <w:t xml:space="preserve">- Architected a RAG </w:t>
+      </w:r>
+      <w:proofErr w:type="spellStart"/>
+      <w:r>
+        <w:t>autograding</w:t>
+      </w:r>
+      <w:proofErr w:type="spellEnd"/>
+      <w:r>
+        <w:t xml:space="preserve"> system for ASN competency assessments using 100,000+ assessment records across Case Analysis, Behavioral Event Interview, and </w:t>
+      </w:r>
+      <w:proofErr w:type="spellStart"/>
+      <w:r>
+        <w:t>QKom</w:t>
+      </w:r>
+      <w:proofErr w:type="spellEnd"/>
+      <w:r>
+        <w:t xml:space="preserve"> Forms.</w:t>
       </w:r>
     </w:p>
     <w:p>
@@ -871,7 +987,35 @@
         <w:rPr>
           <w:b/>
         </w:rPr>
-        <w:t>Rumah Siap Kerja - Learning Program Manager</w:t>
+        <w:t xml:space="preserve">Rumah </w:t>
+      </w:r>
+      <w:proofErr w:type="spellStart"/>
+      <w:r>
+        <w:rPr>
+          <w:b/>
+        </w:rPr>
+        <w:t>Siap</w:t>
+      </w:r>
+      <w:proofErr w:type="spellEnd"/>
+      <w:r>
+        <w:rPr>
+          <w:b/>
+        </w:rPr>
+        <w:t xml:space="preserve"> </w:t>
+      </w:r>
+      <w:proofErr w:type="spellStart"/>
+      <w:r>
+        <w:rPr>
+          <w:b/>
+        </w:rPr>
+        <w:t>Kerja</w:t>
+      </w:r>
+      <w:proofErr w:type="spellEnd"/>
+      <w:r>
+        <w:rPr>
+          <w:b/>
+        </w:rPr>
+        <w:t xml:space="preserve"> - Learning Program Manager</w:t>
       </w:r>
       <w:r>
         <w:rPr>
@@ -923,7 +1067,35 @@
           <w:b/>
         </w:rPr>
         <w:lastRenderedPageBreak/>
-        <w:t>Rumah Siap Kerja - Monitoring &amp; Evaluation Specialist</w:t>
+        <w:t xml:space="preserve">Rumah </w:t>
+      </w:r>
+      <w:proofErr w:type="spellStart"/>
+      <w:r>
+        <w:rPr>
+          <w:b/>
+        </w:rPr>
+        <w:t>Siap</w:t>
+      </w:r>
+      <w:proofErr w:type="spellEnd"/>
+      <w:r>
+        <w:rPr>
+          <w:b/>
+        </w:rPr>
+        <w:t xml:space="preserve"> </w:t>
+      </w:r>
+      <w:proofErr w:type="spellStart"/>
+      <w:r>
+        <w:rPr>
+          <w:b/>
+        </w:rPr>
+        <w:t>Kerja</w:t>
+      </w:r>
+      <w:proofErr w:type="spellEnd"/>
+      <w:r>
+        <w:rPr>
+          <w:b/>
+        </w:rPr>
+        <w:t xml:space="preserve"> - Monitoring &amp; Evaluation Specialist</w:t>
       </w:r>
       <w:r>
         <w:rPr>
@@ -986,11 +1158,19 @@
         <w:pStyle w:val="HRRole"/>
         <w:keepNext/>
       </w:pPr>
+      <w:proofErr w:type="spellStart"/>
       <w:r>
         <w:rPr>
           <w:b/>
         </w:rPr>
-        <w:t>Faxtor Indonesia - Research and Development</w:t>
+        <w:t>Faxtor</w:t>
+      </w:r>
+      <w:proofErr w:type="spellEnd"/>
+      <w:r>
+        <w:rPr>
+          <w:b/>
+        </w:rPr>
+        <w:t xml:space="preserve"> Indonesia - Research and Development</w:t>
       </w:r>
       <w:r>
         <w:rPr>
@@ -1005,7 +1185,15 @@
         <w:pStyle w:val="HRBullet"/>
       </w:pPr>
       <w:r>
-        <w:t>- Developed FCAT cognitive-ability test item sets and refreshed norms; maintained age coverage 11-53 years, 75-90 minute administration time, and &gt;=0.70 reliability on most subtests.</w:t>
+        <w:t xml:space="preserve">- Developed FCAT cognitive-ability test item sets and refreshed norms; maintained age coverage 11-53 years, </w:t>
+      </w:r>
+      <w:proofErr w:type="gramStart"/>
+      <w:r>
+        <w:t>75-90 minute</w:t>
+      </w:r>
+      <w:proofErr w:type="gramEnd"/>
+      <w:r>
+        <w:t xml:space="preserve"> administration time, and &gt;=0.70 reliability on most subtests.</w:t>
       </w:r>
     </w:p>
     <w:p>
@@ -1013,7 +1201,15 @@
         <w:pStyle w:val="HRBullet"/>
       </w:pPr>
       <w:r>
-        <w:t>- Authored Faxtor Career Book content mapping Indonesian occupations to education pathways, required skills, and RIASEC interests; produced 1,000+ pages of career-reference material.</w:t>
+        <w:t xml:space="preserve">- Authored </w:t>
+      </w:r>
+      <w:proofErr w:type="spellStart"/>
+      <w:r>
+        <w:t>Faxtor</w:t>
+      </w:r>
+      <w:proofErr w:type="spellEnd"/>
+      <w:r>
+        <w:t xml:space="preserve"> Career Book content mapping Indonesian occupations to education pathways, required skills, and RIASEC interests; produced 1,000+ pages of career-reference material.</w:t>
       </w:r>
     </w:p>
     <w:p>
@@ -1033,7 +1229,21 @@
         <w:rPr>
           <w:b/>
         </w:rPr>
-        <w:t>PT. Hitam Putih Sandiatma - Training Designer &amp; Facilitator</w:t>
+        <w:t xml:space="preserve">PT. Hitam Putih </w:t>
+      </w:r>
+      <w:proofErr w:type="spellStart"/>
+      <w:r>
+        <w:rPr>
+          <w:b/>
+        </w:rPr>
+        <w:t>Sandiatma</w:t>
+      </w:r>
+      <w:proofErr w:type="spellEnd"/>
+      <w:r>
+        <w:rPr>
+          <w:b/>
+        </w:rPr>
+        <w:t xml:space="preserve"> - Training Designer &amp; Facilitator</w:t>
       </w:r>
       <w:r>
         <w:rPr>
@@ -1641,12 +1851,21 @@
               <w:t xml:space="preserve">; </w:t>
             </w:r>
             <w:hyperlink r:id="rId38" w:anchor="project-entrepreneurship-mentorship-for-sandination-community">
+              <w:proofErr w:type="spellStart"/>
               <w:r>
                 <w:rPr>
                   <w:color w:val="0563C1"/>
                   <w:u w:val="single"/>
                 </w:rPr>
-                <w:t>Sandination Mentorship</w:t>
+                <w:t>Sandination</w:t>
+              </w:r>
+              <w:proofErr w:type="spellEnd"/>
+              <w:r>
+                <w:rPr>
+                  <w:color w:val="0563C1"/>
+                  <w:u w:val="single"/>
+                </w:rPr>
+                <w:t xml:space="preserve"> Mentorship</w:t>
               </w:r>
             </w:hyperlink>
           </w:p>
@@ -1788,22 +2007,57 @@
           <w:b/>
           <w:color w:val="183F60"/>
         </w:rPr>
-        <w:t xml:space="preserve">Universitas Padjadjaran: </w:t>
+        <w:t xml:space="preserve">Universitas </w:t>
+      </w:r>
+      <w:proofErr w:type="spellStart"/>
+      <w:r>
+        <w:rPr>
+          <w:b/>
+          <w:color w:val="183F60"/>
+        </w:rPr>
+        <w:t>Padjadjaran</w:t>
+      </w:r>
+      <w:proofErr w:type="spellEnd"/>
+      <w:r>
+        <w:rPr>
+          <w:b/>
+          <w:color w:val="183F60"/>
+        </w:rPr>
+        <w:t xml:space="preserve">: </w:t>
       </w:r>
       <w:r>
-        <w:t>Bachelor of Psychology (S.Psi.), GPA 3.46/4.00 | Sep 2017-Feb 2021</w:t>
+        <w:t>Bachelor of Psychology (</w:t>
+      </w:r>
+      <w:proofErr w:type="spellStart"/>
+      <w:proofErr w:type="gramStart"/>
+      <w:r>
+        <w:t>S.Psi</w:t>
+      </w:r>
+      <w:proofErr w:type="spellEnd"/>
+      <w:proofErr w:type="gramEnd"/>
+      <w:r>
+        <w:t>.), GPA 3.46/4.00 | Sep 2017-Feb 2021</w:t>
       </w:r>
     </w:p>
     <w:p>
       <w:pPr>
         <w:pStyle w:val="HRBody"/>
       </w:pPr>
+      <w:proofErr w:type="spellStart"/>
       <w:r>
         <w:rPr>
           <w:b/>
           <w:color w:val="183F60"/>
         </w:rPr>
-        <w:t xml:space="preserve">RevoU: </w:t>
+        <w:t>RevoU</w:t>
+      </w:r>
+      <w:proofErr w:type="spellEnd"/>
+      <w:r>
+        <w:rPr>
+          <w:b/>
+          <w:color w:val="183F60"/>
+        </w:rPr>
+        <w:t xml:space="preserve">: </w:t>
       </w:r>
       <w:r>
         <w:t>Full-Stack Data Analytics Certificate | May-Aug 2023</w:t>

</xml_diff>